<commit_message>
Updated report, architecture and UI improvements
</commit_message>
<xml_diff>
--- a/docs/AI-Powered Research Assistant Report.docx
+++ b/docs/AI-Powered Research Assistant Report.docx
@@ -368,23 +368,13 @@
           <w:szCs w:val="24"/>
         </w:rPr>
       </w:pPr>
-      <w:proofErr w:type="spellStart"/>
-      <w:r>
-        <w:rPr>
-          <w:rFonts w:ascii="Times New Roman" w:hAnsi="Times New Roman" w:cs="Times New Roman"/>
-          <w:sz w:val="24"/>
-          <w:szCs w:val="24"/>
-        </w:rPr>
-        <w:t>LangChain</w:t>
-      </w:r>
-      <w:proofErr w:type="spellEnd"/>
-      <w:r>
-        <w:rPr>
-          <w:rFonts w:ascii="Times New Roman" w:hAnsi="Times New Roman" w:cs="Times New Roman"/>
-          <w:sz w:val="24"/>
-          <w:szCs w:val="24"/>
-        </w:rPr>
-        <w:t>,</w:t>
+      <w:r>
+        <w:rPr>
+          <w:rFonts w:ascii="Times New Roman" w:hAnsi="Times New Roman" w:cs="Times New Roman"/>
+          <w:sz w:val="24"/>
+          <w:szCs w:val="24"/>
+        </w:rPr>
+        <w:t>LangChain,</w:t>
       </w:r>
     </w:p>
     <w:p>
@@ -400,23 +390,13 @@
           <w:szCs w:val="24"/>
         </w:rPr>
       </w:pPr>
-      <w:proofErr w:type="spellStart"/>
-      <w:r>
-        <w:rPr>
-          <w:rFonts w:ascii="Times New Roman" w:hAnsi="Times New Roman" w:cs="Times New Roman"/>
-          <w:sz w:val="24"/>
-          <w:szCs w:val="24"/>
-        </w:rPr>
-        <w:t>HuggingFace</w:t>
-      </w:r>
-      <w:proofErr w:type="spellEnd"/>
-      <w:r>
-        <w:rPr>
-          <w:rFonts w:ascii="Times New Roman" w:hAnsi="Times New Roman" w:cs="Times New Roman"/>
-          <w:sz w:val="24"/>
-          <w:szCs w:val="24"/>
-        </w:rPr>
-        <w:t xml:space="preserve"> embeddings,</w:t>
+      <w:r>
+        <w:rPr>
+          <w:rFonts w:ascii="Times New Roman" w:hAnsi="Times New Roman" w:cs="Times New Roman"/>
+          <w:sz w:val="24"/>
+          <w:szCs w:val="24"/>
+        </w:rPr>
+        <w:t>HuggingFace embeddings,</w:t>
       </w:r>
     </w:p>
     <w:p>
@@ -454,23 +434,13 @@
           <w:szCs w:val="24"/>
         </w:rPr>
       </w:pPr>
-      <w:proofErr w:type="spellStart"/>
-      <w:r>
-        <w:rPr>
-          <w:rFonts w:ascii="Times New Roman" w:hAnsi="Times New Roman" w:cs="Times New Roman"/>
-          <w:sz w:val="24"/>
-          <w:szCs w:val="24"/>
-        </w:rPr>
-        <w:t>FastAPI</w:t>
-      </w:r>
-      <w:proofErr w:type="spellEnd"/>
-      <w:r>
-        <w:rPr>
-          <w:rFonts w:ascii="Times New Roman" w:hAnsi="Times New Roman" w:cs="Times New Roman"/>
-          <w:sz w:val="24"/>
-          <w:szCs w:val="24"/>
-        </w:rPr>
-        <w:t xml:space="preserve"> backend services,</w:t>
+      <w:r>
+        <w:rPr>
+          <w:rFonts w:ascii="Times New Roman" w:hAnsi="Times New Roman" w:cs="Times New Roman"/>
+          <w:sz w:val="24"/>
+          <w:szCs w:val="24"/>
+        </w:rPr>
+        <w:t>FastAPI backend services,</w:t>
       </w:r>
     </w:p>
     <w:p>
@@ -492,89 +462,35 @@
           <w:sz w:val="24"/>
           <w:szCs w:val="24"/>
         </w:rPr>
-        <w:t xml:space="preserve">and </w:t>
-      </w:r>
-      <w:proofErr w:type="spellStart"/>
-      <w:r>
-        <w:rPr>
-          <w:rFonts w:ascii="Times New Roman" w:hAnsi="Times New Roman" w:cs="Times New Roman"/>
-          <w:sz w:val="24"/>
-          <w:szCs w:val="24"/>
-        </w:rPr>
-        <w:t>Streamlit</w:t>
-      </w:r>
-      <w:proofErr w:type="spellEnd"/>
-      <w:r>
-        <w:rPr>
-          <w:rFonts w:ascii="Times New Roman" w:hAnsi="Times New Roman" w:cs="Times New Roman"/>
-          <w:sz w:val="24"/>
-          <w:szCs w:val="24"/>
-        </w:rPr>
-        <w:t xml:space="preserve"> frontend interfaces.</w:t>
-      </w:r>
-    </w:p>
-    <w:p>
-      <w:pPr>
-        <w:spacing w:after="0"/>
-        <w:rPr>
-          <w:rFonts w:ascii="Times New Roman" w:hAnsi="Times New Roman" w:cs="Times New Roman"/>
-          <w:sz w:val="24"/>
-          <w:szCs w:val="24"/>
-        </w:rPr>
-      </w:pPr>
-    </w:p>
-    <w:p>
-      <w:pPr>
-        <w:spacing w:after="0"/>
-        <w:rPr>
-          <w:rFonts w:ascii="Times New Roman" w:hAnsi="Times New Roman" w:cs="Times New Roman"/>
-          <w:sz w:val="24"/>
-          <w:szCs w:val="24"/>
-        </w:rPr>
-      </w:pPr>
-      <w:r>
-        <w:rPr>
-          <w:rFonts w:ascii="Times New Roman" w:hAnsi="Times New Roman" w:cs="Times New Roman"/>
-          <w:sz w:val="24"/>
-          <w:szCs w:val="24"/>
-        </w:rPr>
-        <w:t xml:space="preserve">The primary objective of this project was to evaluate multiple AI tools and architectures, build a working prototype, and </w:t>
-      </w:r>
-      <w:proofErr w:type="spellStart"/>
-      <w:r>
-        <w:rPr>
-          <w:rFonts w:ascii="Times New Roman" w:hAnsi="Times New Roman" w:cs="Times New Roman"/>
-          <w:sz w:val="24"/>
-          <w:szCs w:val="24"/>
-        </w:rPr>
-        <w:t>analyze</w:t>
-      </w:r>
-      <w:proofErr w:type="spellEnd"/>
-      <w:r>
-        <w:rPr>
-          <w:rFonts w:ascii="Times New Roman" w:hAnsi="Times New Roman" w:cs="Times New Roman"/>
-          <w:sz w:val="24"/>
-          <w:szCs w:val="24"/>
-        </w:rPr>
-        <w:t xml:space="preserve"> the practical engineering </w:t>
-      </w:r>
-      <w:proofErr w:type="spellStart"/>
-      <w:r>
-        <w:rPr>
-          <w:rFonts w:ascii="Times New Roman" w:hAnsi="Times New Roman" w:cs="Times New Roman"/>
-          <w:sz w:val="24"/>
-          <w:szCs w:val="24"/>
-        </w:rPr>
-        <w:t>tradeoffs</w:t>
-      </w:r>
-      <w:proofErr w:type="spellEnd"/>
-      <w:r>
-        <w:rPr>
-          <w:rFonts w:ascii="Times New Roman" w:hAnsi="Times New Roman" w:cs="Times New Roman"/>
-          <w:sz w:val="24"/>
-          <w:szCs w:val="24"/>
-        </w:rPr>
-        <w:t xml:space="preserve"> involved in deploying an AI-powered research workflow system.</w:t>
+        <w:t>and Streamlit frontend interfaces.</w:t>
+      </w:r>
+    </w:p>
+    <w:p>
+      <w:pPr>
+        <w:spacing w:after="0"/>
+        <w:rPr>
+          <w:rFonts w:ascii="Times New Roman" w:hAnsi="Times New Roman" w:cs="Times New Roman"/>
+          <w:sz w:val="24"/>
+          <w:szCs w:val="24"/>
+        </w:rPr>
+      </w:pPr>
+    </w:p>
+    <w:p>
+      <w:pPr>
+        <w:spacing w:after="0"/>
+        <w:rPr>
+          <w:rFonts w:ascii="Times New Roman" w:hAnsi="Times New Roman" w:cs="Times New Roman"/>
+          <w:sz w:val="24"/>
+          <w:szCs w:val="24"/>
+        </w:rPr>
+      </w:pPr>
+      <w:r>
+        <w:rPr>
+          <w:rFonts w:ascii="Times New Roman" w:hAnsi="Times New Roman" w:cs="Times New Roman"/>
+          <w:sz w:val="24"/>
+          <w:szCs w:val="24"/>
+        </w:rPr>
+        <w:t>The primary objective of this project was to evaluate multiple AI tools and architectures, build a working prototype, and analyze the practical engineering tradeoffs involved in deploying an AI-powered research workflow system.</w:t>
       </w:r>
     </w:p>
     <w:p>
@@ -2948,7 +2864,6 @@
                 <w:szCs w:val="24"/>
               </w:rPr>
             </w:pPr>
-            <w:proofErr w:type="spellStart"/>
             <w:r>
               <w:rPr>
                 <w:rFonts w:ascii="Times New Roman" w:hAnsi="Times New Roman" w:cs="Times New Roman"/>
@@ -2957,7 +2872,6 @@
               </w:rPr>
               <w:t>ChromaDB</w:t>
             </w:r>
-            <w:proofErr w:type="spellEnd"/>
           </w:p>
         </w:tc>
         <w:tc>
@@ -3627,23 +3541,13 @@
           <w:szCs w:val="24"/>
         </w:rPr>
       </w:pPr>
-      <w:proofErr w:type="spellStart"/>
-      <w:r>
-        <w:rPr>
-          <w:rFonts w:ascii="Times New Roman" w:hAnsi="Times New Roman" w:cs="Times New Roman"/>
-          <w:sz w:val="24"/>
-          <w:szCs w:val="24"/>
-        </w:rPr>
-        <w:t>MiniLM</w:t>
-      </w:r>
-      <w:proofErr w:type="spellEnd"/>
-      <w:r>
-        <w:rPr>
-          <w:rFonts w:ascii="Times New Roman" w:hAnsi="Times New Roman" w:cs="Times New Roman"/>
-          <w:sz w:val="24"/>
-          <w:szCs w:val="24"/>
-        </w:rPr>
-        <w:t xml:space="preserve"> embeddings provided strong semantic retrieval quality while allowing:</w:t>
+      <w:r>
+        <w:rPr>
+          <w:rFonts w:ascii="Times New Roman" w:hAnsi="Times New Roman" w:cs="Times New Roman"/>
+          <w:sz w:val="24"/>
+          <w:szCs w:val="24"/>
+        </w:rPr>
+        <w:t>MiniLM embeddings provided strong semantic retrieval quality while allowing:</w:t>
       </w:r>
     </w:p>
     <w:p>
@@ -3879,7 +3783,6 @@
                 <w:szCs w:val="24"/>
               </w:rPr>
             </w:pPr>
-            <w:proofErr w:type="spellStart"/>
             <w:r>
               <w:rPr>
                 <w:rFonts w:ascii="Times New Roman" w:hAnsi="Times New Roman" w:cs="Times New Roman"/>
@@ -3888,7 +3791,6 @@
               </w:rPr>
               <w:t>PyPDFLoader</w:t>
             </w:r>
-            <w:proofErr w:type="spellEnd"/>
           </w:p>
         </w:tc>
         <w:tc>
@@ -3961,7 +3863,6 @@
                 <w:szCs w:val="24"/>
               </w:rPr>
             </w:pPr>
-            <w:proofErr w:type="spellStart"/>
             <w:r>
               <w:rPr>
                 <w:rFonts w:ascii="Times New Roman" w:hAnsi="Times New Roman" w:cs="Times New Roman"/>
@@ -3970,7 +3871,6 @@
               </w:rPr>
               <w:t>LlamaParse</w:t>
             </w:r>
-            <w:proofErr w:type="spellEnd"/>
           </w:p>
         </w:tc>
         <w:tc>
@@ -4156,47 +4056,25 @@
           <w:sz w:val="24"/>
           <w:szCs w:val="24"/>
         </w:rPr>
-        <w:t xml:space="preserve"> </w:t>
-      </w:r>
-      <w:proofErr w:type="spellStart"/>
-      <w:r>
-        <w:rPr>
-          <w:rFonts w:ascii="Times New Roman" w:hAnsi="Times New Roman" w:cs="Times New Roman"/>
-          <w:b/>
-          <w:bCs/>
-          <w:sz w:val="24"/>
-          <w:szCs w:val="24"/>
-        </w:rPr>
-        <w:t>PyPDFLoader</w:t>
-      </w:r>
-      <w:proofErr w:type="spellEnd"/>
-    </w:p>
-    <w:p>
-      <w:pPr>
-        <w:spacing w:after="0"/>
-        <w:rPr>
-          <w:rFonts w:ascii="Times New Roman" w:hAnsi="Times New Roman" w:cs="Times New Roman"/>
-          <w:sz w:val="24"/>
-          <w:szCs w:val="24"/>
-        </w:rPr>
-      </w:pPr>
-      <w:proofErr w:type="spellStart"/>
-      <w:r>
-        <w:rPr>
-          <w:rFonts w:ascii="Times New Roman" w:hAnsi="Times New Roman" w:cs="Times New Roman"/>
-          <w:sz w:val="24"/>
-          <w:szCs w:val="24"/>
-        </w:rPr>
-        <w:t>PyPDFLoader</w:t>
-      </w:r>
-      <w:proofErr w:type="spellEnd"/>
-      <w:r>
-        <w:rPr>
-          <w:rFonts w:ascii="Times New Roman" w:hAnsi="Times New Roman" w:cs="Times New Roman"/>
-          <w:sz w:val="24"/>
-          <w:szCs w:val="24"/>
-        </w:rPr>
-        <w:t xml:space="preserve"> provided sufficient extraction quality for research PDFs while maintaining lightweight deployment and rapid integration into the RAG pipeline.</w:t>
+        <w:t xml:space="preserve"> PyPDFLoader</w:t>
+      </w:r>
+    </w:p>
+    <w:p>
+      <w:pPr>
+        <w:spacing w:after="0"/>
+        <w:rPr>
+          <w:rFonts w:ascii="Times New Roman" w:hAnsi="Times New Roman" w:cs="Times New Roman"/>
+          <w:sz w:val="24"/>
+          <w:szCs w:val="24"/>
+        </w:rPr>
+      </w:pPr>
+      <w:r>
+        <w:rPr>
+          <w:rFonts w:ascii="Times New Roman" w:hAnsi="Times New Roman" w:cs="Times New Roman"/>
+          <w:sz w:val="24"/>
+          <w:szCs w:val="24"/>
+        </w:rPr>
+        <w:t>PyPDFLoader provided sufficient extraction quality for research PDFs while maintaining lightweight deployment and rapid integration into the RAG pipeline.</w:t>
       </w:r>
     </w:p>
     <w:p>
@@ -4258,6 +4136,38 @@
         </w:rPr>
         <w:t>The implemented architecture follows a modular Retrieval-Augmented Generation (RAG) workflow.</w:t>
       </w:r>
+      <w:r>
+        <w:rPr>
+          <w:rFonts w:ascii="Times New Roman" w:hAnsi="Times New Roman" w:cs="Times New Roman"/>
+          <w:sz w:val="24"/>
+          <w:szCs w:val="24"/>
+        </w:rPr>
+        <w:t xml:space="preserve"> </w:t>
+      </w:r>
+      <w:r>
+        <w:rPr>
+          <w:rFonts w:ascii="Times New Roman" w:hAnsi="Times New Roman" w:cs="Times New Roman"/>
+          <w:sz w:val="24"/>
+          <w:szCs w:val="24"/>
+        </w:rPr>
+        <w:t>Figure 1 illustrates the end-to-end Retrieval-Augmented Generation (RAG)</w:t>
+      </w:r>
+      <w:r>
+        <w:rPr>
+          <w:rFonts w:ascii="Times New Roman" w:hAnsi="Times New Roman" w:cs="Times New Roman"/>
+          <w:sz w:val="24"/>
+          <w:szCs w:val="24"/>
+        </w:rPr>
+        <w:t xml:space="preserve"> </w:t>
+      </w:r>
+      <w:r>
+        <w:rPr>
+          <w:rFonts w:ascii="Times New Roman" w:hAnsi="Times New Roman" w:cs="Times New Roman"/>
+          <w:sz w:val="24"/>
+          <w:szCs w:val="24"/>
+        </w:rPr>
+        <w:t>workflow implemented in the proposed AI Research Assistant system.</w:t>
+      </w:r>
     </w:p>
     <w:p>
       <w:pPr>
@@ -4432,6 +4342,7 @@
           <w:sz w:val="24"/>
           <w:szCs w:val="24"/>
         </w:rPr>
+        <w:lastRenderedPageBreak/>
         <w:t>Relevant chunks are retrieved</w:t>
       </w:r>
     </w:p>
@@ -4454,7 +4365,6 @@
           <w:sz w:val="24"/>
           <w:szCs w:val="24"/>
         </w:rPr>
-        <w:lastRenderedPageBreak/>
         <w:t>Retrieved context is injected into Gemini</w:t>
       </w:r>
     </w:p>
@@ -4686,7 +4596,6 @@
                 <w:szCs w:val="24"/>
               </w:rPr>
             </w:pPr>
-            <w:proofErr w:type="spellStart"/>
             <w:r>
               <w:rPr>
                 <w:rFonts w:ascii="Times New Roman" w:hAnsi="Times New Roman" w:cs="Times New Roman"/>
@@ -4695,7 +4604,6 @@
               </w:rPr>
               <w:t>LangChain</w:t>
             </w:r>
-            <w:proofErr w:type="spellEnd"/>
           </w:p>
         </w:tc>
       </w:tr>
@@ -4853,7 +4761,6 @@
                 <w:szCs w:val="24"/>
               </w:rPr>
             </w:pPr>
-            <w:proofErr w:type="spellStart"/>
             <w:r>
               <w:rPr>
                 <w:rFonts w:ascii="Times New Roman" w:hAnsi="Times New Roman" w:cs="Times New Roman"/>
@@ -4862,7 +4769,6 @@
               </w:rPr>
               <w:t>PyPDFLoader</w:t>
             </w:r>
-            <w:proofErr w:type="spellEnd"/>
           </w:p>
         </w:tc>
       </w:tr>
@@ -4910,7 +4816,6 @@
                 <w:szCs w:val="24"/>
               </w:rPr>
             </w:pPr>
-            <w:proofErr w:type="spellStart"/>
             <w:r>
               <w:rPr>
                 <w:rFonts w:ascii="Times New Roman" w:hAnsi="Times New Roman" w:cs="Times New Roman"/>
@@ -4919,7 +4824,6 @@
               </w:rPr>
               <w:t>FastAPI</w:t>
             </w:r>
-            <w:proofErr w:type="spellEnd"/>
           </w:p>
         </w:tc>
       </w:tr>
@@ -4967,7 +4871,6 @@
                 <w:szCs w:val="24"/>
               </w:rPr>
             </w:pPr>
-            <w:proofErr w:type="spellStart"/>
             <w:r>
               <w:rPr>
                 <w:rFonts w:ascii="Times New Roman" w:hAnsi="Times New Roman" w:cs="Times New Roman"/>
@@ -4976,7 +4879,6 @@
               </w:rPr>
               <w:t>Streamlit</w:t>
             </w:r>
-            <w:proofErr w:type="spellEnd"/>
           </w:p>
         </w:tc>
       </w:tr>
@@ -4996,6 +4898,105 @@
         <w:spacing w:after="0"/>
         <w:rPr>
           <w:rFonts w:ascii="Times New Roman" w:hAnsi="Times New Roman" w:cs="Times New Roman"/>
+          <w:sz w:val="24"/>
+          <w:szCs w:val="24"/>
+        </w:rPr>
+      </w:pPr>
+      <w:r>
+        <w:rPr>
+          <w:rFonts w:ascii="Times New Roman" w:hAnsi="Times New Roman" w:cs="Times New Roman"/>
+          <w:noProof/>
+          <w:sz w:val="24"/>
+          <w:szCs w:val="24"/>
+        </w:rPr>
+        <w:drawing>
+          <wp:inline distT="0" distB="0" distL="0" distR="0" wp14:anchorId="6D9DF7C1" wp14:editId="229ED29A">
+            <wp:extent cx="5731510" cy="695325"/>
+            <wp:effectExtent l="0" t="0" r="2540" b="9525"/>
+            <wp:docPr id="1124050547" name="Picture 2"/>
+            <wp:cNvGraphicFramePr>
+              <a:graphicFrameLocks xmlns:a="http://schemas.openxmlformats.org/drawingml/2006/main" noChangeAspect="1"/>
+            </wp:cNvGraphicFramePr>
+            <a:graphic xmlns:a="http://schemas.openxmlformats.org/drawingml/2006/main">
+              <a:graphicData uri="http://schemas.openxmlformats.org/drawingml/2006/picture">
+                <pic:pic xmlns:pic="http://schemas.openxmlformats.org/drawingml/2006/picture">
+                  <pic:nvPicPr>
+                    <pic:cNvPr id="1124050547" name="Picture 1124050547"/>
+                    <pic:cNvPicPr/>
+                  </pic:nvPicPr>
+                  <pic:blipFill>
+                    <a:blip r:embed="rId6" cstate="print">
+                      <a:extLst>
+                        <a:ext uri="{28A0092B-C50C-407E-A947-70E740481C1C}">
+                          <a14:useLocalDpi xmlns:a14="http://schemas.microsoft.com/office/drawing/2010/main" val="0"/>
+                        </a:ext>
+                      </a:extLst>
+                    </a:blip>
+                    <a:stretch>
+                      <a:fillRect/>
+                    </a:stretch>
+                  </pic:blipFill>
+                  <pic:spPr>
+                    <a:xfrm>
+                      <a:off x="0" y="0"/>
+                      <a:ext cx="5738492" cy="696172"/>
+                    </a:xfrm>
+                    <a:prstGeom prst="rect">
+                      <a:avLst/>
+                    </a:prstGeom>
+                  </pic:spPr>
+                </pic:pic>
+              </a:graphicData>
+            </a:graphic>
+          </wp:inline>
+        </w:drawing>
+      </w:r>
+    </w:p>
+    <w:p>
+      <w:pPr>
+        <w:spacing w:after="0"/>
+        <w:rPr>
+          <w:rFonts w:ascii="Times New Roman" w:hAnsi="Times New Roman" w:cs="Times New Roman"/>
+          <w:sz w:val="24"/>
+          <w:szCs w:val="24"/>
+        </w:rPr>
+      </w:pPr>
+      <w:r>
+        <w:rPr>
+          <w:rFonts w:ascii="Times New Roman" w:hAnsi="Times New Roman" w:cs="Times New Roman"/>
+          <w:b/>
+          <w:bCs/>
+          <w:sz w:val="24"/>
+          <w:szCs w:val="24"/>
+        </w:rPr>
+        <w:t>Figure 1.</w:t>
+      </w:r>
+      <w:r>
+        <w:rPr>
+          <w:rFonts w:ascii="Times New Roman" w:hAnsi="Times New Roman" w:cs="Times New Roman"/>
+          <w:sz w:val="24"/>
+          <w:szCs w:val="24"/>
+        </w:rPr>
+        <w:t xml:space="preserve"> System Architecture</w:t>
+      </w:r>
+    </w:p>
+    <w:p>
+      <w:pPr>
+        <w:spacing w:after="0"/>
+        <w:rPr>
+          <w:rFonts w:ascii="Times New Roman" w:hAnsi="Times New Roman" w:cs="Times New Roman"/>
+          <w:b/>
+          <w:bCs/>
+          <w:sz w:val="24"/>
+          <w:szCs w:val="24"/>
+        </w:rPr>
+      </w:pPr>
+    </w:p>
+    <w:p>
+      <w:pPr>
+        <w:spacing w:after="0"/>
+        <w:rPr>
+          <w:rFonts w:ascii="Times New Roman" w:hAnsi="Times New Roman" w:cs="Times New Roman"/>
           <w:b/>
           <w:bCs/>
           <w:sz w:val="24"/>
@@ -5106,23 +5107,13 @@
           <w:szCs w:val="24"/>
         </w:rPr>
       </w:pPr>
-      <w:proofErr w:type="spellStart"/>
-      <w:r>
-        <w:rPr>
-          <w:rFonts w:ascii="Times New Roman" w:hAnsi="Times New Roman" w:cs="Times New Roman"/>
-          <w:sz w:val="24"/>
-          <w:szCs w:val="24"/>
-        </w:rPr>
-        <w:t>CrewAI</w:t>
-      </w:r>
-      <w:proofErr w:type="spellEnd"/>
-      <w:r>
-        <w:rPr>
-          <w:rFonts w:ascii="Times New Roman" w:hAnsi="Times New Roman" w:cs="Times New Roman"/>
-          <w:sz w:val="24"/>
-          <w:szCs w:val="24"/>
-        </w:rPr>
-        <w:t xml:space="preserve"> orchestration was initially explored; however, lightweight sequential orchestration was ultimately selected due to:</w:t>
+      <w:r>
+        <w:rPr>
+          <w:rFonts w:ascii="Times New Roman" w:hAnsi="Times New Roman" w:cs="Times New Roman"/>
+          <w:sz w:val="24"/>
+          <w:szCs w:val="24"/>
+        </w:rPr>
+        <w:t>CrewAI orchestration was initially explored; however, lightweight sequential orchestration was ultimately selected due to:</w:t>
       </w:r>
     </w:p>
     <w:p>
@@ -5385,23 +5376,13 @@
           <w:szCs w:val="24"/>
         </w:rPr>
       </w:pPr>
-      <w:proofErr w:type="spellStart"/>
-      <w:r>
-        <w:rPr>
-          <w:rFonts w:ascii="Times New Roman" w:hAnsi="Times New Roman" w:cs="Times New Roman"/>
-          <w:sz w:val="24"/>
-          <w:szCs w:val="24"/>
-        </w:rPr>
-        <w:t>FastAPI</w:t>
-      </w:r>
-      <w:proofErr w:type="spellEnd"/>
-      <w:r>
-        <w:rPr>
-          <w:rFonts w:ascii="Times New Roman" w:hAnsi="Times New Roman" w:cs="Times New Roman"/>
-          <w:sz w:val="24"/>
-          <w:szCs w:val="24"/>
-        </w:rPr>
-        <w:t xml:space="preserve"> APIs</w:t>
+      <w:r>
+        <w:rPr>
+          <w:rFonts w:ascii="Times New Roman" w:hAnsi="Times New Roman" w:cs="Times New Roman"/>
+          <w:sz w:val="24"/>
+          <w:szCs w:val="24"/>
+        </w:rPr>
+        <w:t>FastAPI APIs</w:t>
       </w:r>
     </w:p>
     <w:p>
@@ -5516,23 +5497,14 @@
           <w:szCs w:val="24"/>
         </w:rPr>
       </w:pPr>
-      <w:proofErr w:type="spellStart"/>
-      <w:r>
-        <w:rPr>
-          <w:rFonts w:ascii="Times New Roman" w:hAnsi="Times New Roman" w:cs="Times New Roman"/>
-          <w:sz w:val="24"/>
-          <w:szCs w:val="24"/>
-        </w:rPr>
-        <w:t>Streamlit</w:t>
-      </w:r>
-      <w:proofErr w:type="spellEnd"/>
-      <w:r>
-        <w:rPr>
-          <w:rFonts w:ascii="Times New Roman" w:hAnsi="Times New Roman" w:cs="Times New Roman"/>
-          <w:sz w:val="24"/>
-          <w:szCs w:val="24"/>
-        </w:rPr>
-        <w:t>-based UI</w:t>
+      <w:r>
+        <w:rPr>
+          <w:rFonts w:ascii="Times New Roman" w:hAnsi="Times New Roman" w:cs="Times New Roman"/>
+          <w:sz w:val="24"/>
+          <w:szCs w:val="24"/>
+        </w:rPr>
+        <w:lastRenderedPageBreak/>
+        <w:t>Streamlit-based UI</w:t>
       </w:r>
     </w:p>
     <w:p>
@@ -5671,7 +5643,6 @@
           <w:sz w:val="24"/>
           <w:szCs w:val="24"/>
         </w:rPr>
-        <w:lastRenderedPageBreak/>
         <w:t>bibliography-heavy chunks occasionally reduced retrieval quality,</w:t>
       </w:r>
     </w:p>
@@ -6018,23 +5989,13 @@
                 <w:szCs w:val="24"/>
               </w:rPr>
             </w:pPr>
-            <w:proofErr w:type="spellStart"/>
             <w:r>
               <w:rPr>
                 <w:rFonts w:ascii="Times New Roman" w:hAnsi="Times New Roman" w:cs="Times New Roman"/>
                 <w:sz w:val="24"/>
                 <w:szCs w:val="24"/>
               </w:rPr>
-              <w:t>HuggingFace</w:t>
-            </w:r>
-            <w:proofErr w:type="spellEnd"/>
-            <w:r>
-              <w:rPr>
-                <w:rFonts w:ascii="Times New Roman" w:hAnsi="Times New Roman" w:cs="Times New Roman"/>
-                <w:sz w:val="24"/>
-                <w:szCs w:val="24"/>
-              </w:rPr>
-              <w:t xml:space="preserve"> Embeddings</w:t>
+              <w:t>HuggingFace Embeddings</w:t>
             </w:r>
           </w:p>
         </w:tc>
@@ -6083,7 +6044,6 @@
                 <w:szCs w:val="24"/>
               </w:rPr>
             </w:pPr>
-            <w:proofErr w:type="spellStart"/>
             <w:r>
               <w:rPr>
                 <w:rFonts w:ascii="Times New Roman" w:hAnsi="Times New Roman" w:cs="Times New Roman"/>
@@ -6092,7 +6052,6 @@
               </w:rPr>
               <w:t>FastAPI</w:t>
             </w:r>
-            <w:proofErr w:type="spellEnd"/>
           </w:p>
         </w:tc>
         <w:tc>
@@ -6140,7 +6099,6 @@
                 <w:szCs w:val="24"/>
               </w:rPr>
             </w:pPr>
-            <w:proofErr w:type="spellStart"/>
             <w:r>
               <w:rPr>
                 <w:rFonts w:ascii="Times New Roman" w:hAnsi="Times New Roman" w:cs="Times New Roman"/>
@@ -6149,7 +6107,6 @@
               </w:rPr>
               <w:t>Streamlit</w:t>
             </w:r>
-            <w:proofErr w:type="spellEnd"/>
           </w:p>
         </w:tc>
         <w:tc>
@@ -6276,25 +6233,7 @@
           <w:sz w:val="24"/>
           <w:szCs w:val="24"/>
         </w:rPr>
-        <w:t xml:space="preserve">Pinecone or </w:t>
-      </w:r>
-      <w:proofErr w:type="spellStart"/>
-      <w:r>
-        <w:rPr>
-          <w:rFonts w:ascii="Times New Roman" w:hAnsi="Times New Roman" w:cs="Times New Roman"/>
-          <w:sz w:val="24"/>
-          <w:szCs w:val="24"/>
-        </w:rPr>
-        <w:t>Weaviate</w:t>
-      </w:r>
-      <w:proofErr w:type="spellEnd"/>
-      <w:r>
-        <w:rPr>
-          <w:rFonts w:ascii="Times New Roman" w:hAnsi="Times New Roman" w:cs="Times New Roman"/>
-          <w:sz w:val="24"/>
-          <w:szCs w:val="24"/>
-        </w:rPr>
-        <w:t xml:space="preserve"> for distributed retrieval,</w:t>
+        <w:t>Pinecone or Weaviate for distributed retrieval,</w:t>
       </w:r>
     </w:p>
     <w:p>
@@ -6580,6 +6519,7 @@
           <w:sz w:val="24"/>
           <w:szCs w:val="24"/>
         </w:rPr>
+        <w:lastRenderedPageBreak/>
         <w:t>This project successfully demonstrates the design and implementation of an AI-powered Research Assistant using Retrieval-Augmented Generation (RAG) principles.</w:t>
       </w:r>
       <w:r>
@@ -6722,7 +6662,6 @@
           <w:sz w:val="24"/>
           <w:szCs w:val="24"/>
         </w:rPr>
-        <w:lastRenderedPageBreak/>
         <w:t>The implemented architecture achieved a strong balance between:</w:t>
       </w:r>
     </w:p>

</xml_diff>